<commit_message>
Update ESO 2 and TCC
</commit_message>
<xml_diff>
--- a/TCC/TCC.docx
+++ b/TCC/TCC.docx
@@ -965,7 +965,7 @@
     <w:p>
       <w:pPr>
         <w:spacing w:line="360" w:lineRule="auto"/>
-        <w:jc w:val="center"/>
+        <w:jc w:val="right"/>
         <w:rPr>
           <w:rFonts w:ascii="Times New Roman" w:cs="Times New Roman" w:eastAsia="Times New Roman" w:hAnsi="Times New Roman"/>
           <w:sz w:val="24"/>
@@ -981,7 +981,33 @@
           <w:highlight w:val="white"/>
           <w:rtl w:val="0"/>
         </w:rPr>
-        <w:t xml:space="preserve">.</w:t>
+        <w:t xml:space="preserve">.Co</w:t>
+      </w:r>
+      <w:r>
+        <w:rPr>
+          <w:highlight w:val="white"/>
+          <w:rtl w:val="0"/>
+        </w:rPr>
+        <w:t xml:space="preserve">orientador: Prof. </w:t>
+      </w:r>
+      <w:r>
+        <w:rPr>
+          <w:highlight w:val="white"/>
+          <w:rtl w:val="0"/>
+        </w:rPr>
+        <w:t xml:space="preserve">Dr</w:t>
+      </w:r>
+      <w:r>
+        <w:rPr>
+          <w:highlight w:val="white"/>
+          <w:rtl w:val="0"/>
+        </w:rPr>
+        <w:t xml:space="preserve">. David Lerma Ledezma</w:t>
+      </w:r>
+      <w:r>
+        <w:rPr>
+          <w:rtl w:val="0"/>
+        </w:rPr>
       </w:r>
     </w:p>
     <w:p>
@@ -1410,9 +1436,9 @@
         <w:rPr/>
         <w:drawing>
           <wp:inline distB="114300" distT="114300" distL="114300" distR="114300">
-            <wp:extent cx="5040000" cy="3074400"/>
+            <wp:extent cx="5400000" cy="3294000"/>
             <wp:effectExtent b="0" l="0" r="0" t="0"/>
-            <wp:docPr id="16" name="image1.png"/>
+            <wp:docPr id="22" name="image1.png"/>
             <a:graphic>
               <a:graphicData uri="http://schemas.openxmlformats.org/drawingml/2006/picture">
                 <pic:pic>
@@ -1430,7 +1456,7 @@
                   <pic:spPr>
                     <a:xfrm>
                       <a:off x="0" y="0"/>
-                      <a:ext cx="5040000" cy="3074400"/>
+                      <a:ext cx="5400000" cy="3294000"/>
                     </a:xfrm>
                     <a:prstGeom prst="rect"/>
                     <a:ln/>
@@ -1450,7 +1476,6 @@
     <w:p>
       <w:pPr>
         <w:spacing w:line="360" w:lineRule="auto"/>
-        <w:ind w:left="0" w:firstLine="0"/>
         <w:jc w:val="left"/>
         <w:rPr>
           <w:rFonts w:ascii="Times New Roman" w:cs="Times New Roman" w:eastAsia="Times New Roman" w:hAnsi="Times New Roman"/>
@@ -2008,12 +2033,26 @@
       </w:pPr>
       <w:r>
         <w:rPr>
-          <w:rFonts w:ascii="Times New Roman" w:cs="Times New Roman" w:eastAsia="Times New Roman" w:hAnsi="Times New Roman"/>
-          <w:sz w:val="24"/>
-          <w:szCs w:val="24"/>
-          <w:rtl w:val="0"/>
-        </w:rPr>
-        <w:t xml:space="preserve">Banca Examinadora</w:t>
+          <w:rtl w:val="0"/>
+        </w:rPr>
+        <w:t xml:space="preserve">Prof. </w:t>
+      </w:r>
+      <w:r>
+        <w:rPr>
+          <w:rtl w:val="0"/>
+        </w:rPr>
+        <w:t xml:space="preserve">Dr</w:t>
+      </w:r>
+      <w:r>
+        <w:rPr>
+          <w:rtl w:val="0"/>
+        </w:rPr>
+        <w:t xml:space="preserve">. David Lerma Ledezma (Coorientador)</w:t>
+      </w:r>
+      <w:r>
+        <w:rPr>
+          <w:rtl w:val="0"/>
+        </w:rPr>
       </w:r>
     </w:p>
     <w:p>
@@ -2822,7 +2861,7 @@
     </w:p>
     <w:p>
       <w:pPr>
-        <w:spacing w:before="200" w:line="360" w:lineRule="auto"/>
+        <w:spacing w:after="0" w:before="0" w:line="360" w:lineRule="auto"/>
         <w:ind w:firstLine="720"/>
         <w:jc w:val="both"/>
         <w:rPr>
@@ -2843,7 +2882,7 @@
     </w:p>
     <w:p>
       <w:pPr>
-        <w:spacing w:before="200" w:line="360" w:lineRule="auto"/>
+        <w:spacing w:before="0" w:line="360" w:lineRule="auto"/>
         <w:jc w:val="both"/>
         <w:rPr>
           <w:rFonts w:ascii="Times New Roman" w:cs="Times New Roman" w:eastAsia="Times New Roman" w:hAnsi="Times New Roman"/>
@@ -2885,7 +2924,18 @@
           <w:szCs w:val="24"/>
           <w:rtl w:val="0"/>
         </w:rPr>
-        <w:t xml:space="preserve"> Iogurte. Envase. Arduino.</w:t>
+        <w:t xml:space="preserve"> Iogurte. Envase. Arduino. </w:t>
+      </w:r>
+      <w:r>
+        <w:rPr>
+          <w:rtl w:val="0"/>
+        </w:rPr>
+        <w:t xml:space="preserve">Baixo custo. Automação.</w:t>
+      </w:r>
+      <w:r>
+        <w:rPr>
+          <w:rtl w:val="0"/>
+        </w:rPr>
       </w:r>
     </w:p>
     <w:p>
@@ -2974,7 +3024,7 @@
     </w:p>
     <w:p>
       <w:pPr>
-        <w:spacing w:after="240" w:before="240" w:line="360" w:lineRule="auto"/>
+        <w:spacing w:after="0" w:before="0" w:line="360" w:lineRule="auto"/>
         <w:jc w:val="both"/>
         <w:rPr>
           <w:rFonts w:ascii="Times New Roman" w:cs="Times New Roman" w:eastAsia="Times New Roman" w:hAnsi="Times New Roman"/>
@@ -3000,7 +3050,18 @@
           <w:szCs w:val="24"/>
           <w:rtl w:val="0"/>
         </w:rPr>
-        <w:t xml:space="preserve"> yogurt; filling; packaging.</w:t>
+        <w:t xml:space="preserve"> </w:t>
+      </w:r>
+      <w:r>
+        <w:rPr>
+          <w:rtl w:val="0"/>
+        </w:rPr>
+        <w:t xml:space="preserve">Yogurt. Packaging. Arduino. Low cost. Automation.</w:t>
+      </w:r>
+      <w:r>
+        <w:rPr>
+          <w:rtl w:val="0"/>
+        </w:rPr>
       </w:r>
     </w:p>
     <w:p>
@@ -3044,7 +3105,7 @@
     </w:p>
     <w:sdt>
       <w:sdtPr>
-        <w:id w:val="-2067707346"/>
+        <w:id w:val="-231358076"/>
         <w:docPartObj>
           <w:docPartGallery w:val="Table of Contents"/>
           <w:docPartUnique w:val="1"/>
@@ -3099,7 +3160,7 @@
               </w:rPr>
               <w:t xml:space="preserve">Figura 1 - Envasadora de Líquido e Pasta</w:t>
               <w:tab/>
-              <w:t xml:space="preserve">16</w:t>
+              <w:t xml:space="preserve">17</w:t>
             </w:r>
           </w:hyperlink>
           <w:r>
@@ -3151,7 +3212,7 @@
               </w:rPr>
               <w:t xml:space="preserve">Figura 2 - Bomba de Diafragma</w:t>
               <w:tab/>
-              <w:t xml:space="preserve">17</w:t>
+              <w:t xml:space="preserve">18</w:t>
             </w:r>
           </w:hyperlink>
           <w:r>
@@ -3203,7 +3264,7 @@
               </w:rPr>
               <w:t xml:space="preserve">Figura 3 - Módulo HX711</w:t>
               <w:tab/>
-              <w:t xml:space="preserve">18</w:t>
+              <w:t xml:space="preserve">19</w:t>
             </w:r>
           </w:hyperlink>
           <w:r>
@@ -3255,7 +3316,7 @@
               </w:rPr>
               <w:t xml:space="preserve">Figura 4 - Célula de Carga</w:t>
               <w:tab/>
-              <w:t xml:space="preserve">18</w:t>
+              <w:t xml:space="preserve">19</w:t>
             </w:r>
           </w:hyperlink>
           <w:r>
@@ -3307,7 +3368,7 @@
               </w:rPr>
               <w:t xml:space="preserve">Figura 5 - Arduino UNO</w:t>
               <w:tab/>
-              <w:t xml:space="preserve">19</w:t>
+              <w:t xml:space="preserve">20</w:t>
             </w:r>
           </w:hyperlink>
           <w:r>
@@ -3359,7 +3420,7 @@
               </w:rPr>
               <w:t xml:space="preserve">Figura 6 - Ambiente do editor</w:t>
               <w:tab/>
-              <w:t xml:space="preserve">20</w:t>
+              <w:t xml:space="preserve">21</w:t>
             </w:r>
           </w:hyperlink>
           <w:r>
@@ -3411,7 +3472,7 @@
               </w:rPr>
               <w:t xml:space="preserve">Figura 7 - Relé</w:t>
               <w:tab/>
-              <w:t xml:space="preserve">21</w:t>
+              <w:t xml:space="preserve">22</w:t>
             </w:r>
           </w:hyperlink>
           <w:r>
@@ -3463,7 +3524,7 @@
               </w:rPr>
               <w:t xml:space="preserve">Figura 8 - LED</w:t>
               <w:tab/>
-              <w:t xml:space="preserve">21</w:t>
+              <w:t xml:space="preserve">22</w:t>
             </w:r>
           </w:hyperlink>
           <w:r>
@@ -3515,7 +3576,7 @@
               </w:rPr>
               <w:t xml:space="preserve">Figura 9 - Tela LCD com interface I2C</w:t>
               <w:tab/>
-              <w:t xml:space="preserve">22</w:t>
+              <w:t xml:space="preserve">23</w:t>
             </w:r>
           </w:hyperlink>
           <w:r>
@@ -3567,7 +3628,7 @@
               </w:rPr>
               <w:t xml:space="preserve">Figura 10 - Botão</w:t>
               <w:tab/>
-              <w:t xml:space="preserve">23</w:t>
+              <w:t xml:space="preserve">24</w:t>
             </w:r>
           </w:hyperlink>
           <w:r>
@@ -3640,7 +3701,380 @@
     </w:p>
     <w:sdt>
       <w:sdtPr>
-        <w:id w:val="1386118671"/>
+        <w:id w:val="-1421810283"/>
+        <w:docPartObj>
+          <w:docPartGallery w:val="Table of Contents"/>
+          <w:docPartUnique w:val="1"/>
+        </w:docPartObj>
+      </w:sdtPr>
+      <w:sdtContent>
+        <w:p>
+          <w:pPr>
+            <w:widowControl w:val="0"/>
+            <w:tabs>
+              <w:tab w:val="right" w:leader="dot" w:pos="12000"/>
+            </w:tabs>
+            <w:spacing w:before="60" w:line="240" w:lineRule="auto"/>
+            <w:rPr>
+              <w:rFonts w:ascii="Arial" w:cs="Arial" w:eastAsia="Arial" w:hAnsi="Arial"/>
+              <w:b w:val="1"/>
+              <w:bCs w:val="1"/>
+              <w:i w:val="0"/>
+              <w:iCs w:val="0"/>
+              <w:smallCaps w:val="0"/>
+              <w:strike w:val="0"/>
+              <w:color w:val="000000"/>
+              <w:sz w:val="22"/>
+              <w:szCs w:val="22"/>
+              <w:u w:val="none"/>
+              <w:shd w:fill="auto" w:val="clear"/>
+              <w:vertAlign w:val="baseline"/>
+            </w:rPr>
+          </w:pPr>
+          <w:r>
+            <w:fldChar w:fldCharType="begin"/>
+            <w:instrText xml:space="preserve"> TOC \h \u \z \t "Heading 4,1,Heading 5,5,"</w:instrText>
+            <w:fldChar w:fldCharType="separate"/>
+          </w:r>
+          <w:hyperlink w:anchor="_heading=h.hf9dm8okyz68">
+            <w:r>
+              <w:rPr>
+                <w:rFonts w:ascii="Times New Roman" w:cs="Times New Roman" w:eastAsia="Times New Roman" w:hAnsi="Times New Roman"/>
+                <w:b w:val="0"/>
+                <w:bCs w:val="0"/>
+                <w:i w:val="0"/>
+                <w:iCs w:val="0"/>
+                <w:smallCaps w:val="0"/>
+                <w:strike w:val="0"/>
+                <w:color w:val="000000"/>
+                <w:sz w:val="24"/>
+                <w:szCs w:val="24"/>
+                <w:u w:val="none"/>
+                <w:shd w:fill="auto" w:val="clear"/>
+                <w:vertAlign w:val="baseline"/>
+                <w:rtl w:val="0"/>
+              </w:rPr>
+              <w:t xml:space="preserve">Tabela 1 - Tabela da lista de materiais com valores</w:t>
+              <w:tab/>
+              <w:t xml:space="preserve">28</w:t>
+            </w:r>
+          </w:hyperlink>
+          <w:r>
+            <w:rPr>
+              <w:rtl w:val="0"/>
+            </w:rPr>
+          </w:r>
+          <w:r>
+            <w:fldChar w:fldCharType="end"/>
+          </w:r>
+        </w:p>
+      </w:sdtContent>
+    </w:sdt>
+    <w:p>
+      <w:pPr>
+        <w:spacing w:after="0" w:line="360" w:lineRule="auto"/>
+        <w:jc w:val="both"/>
+        <w:rPr>
+          <w:rFonts w:ascii="Times New Roman" w:cs="Times New Roman" w:eastAsia="Times New Roman" w:hAnsi="Times New Roman"/>
+          <w:b w:val="1"/>
+          <w:bCs w:val="1"/>
+          <w:sz w:val="24"/>
+          <w:szCs w:val="24"/>
+        </w:rPr>
+      </w:pPr>
+      <w:r>
+        <w:rPr>
+          <w:rtl w:val="0"/>
+        </w:rPr>
+      </w:r>
+    </w:p>
+    <w:p>
+      <w:pPr>
+        <w:spacing w:after="360" w:line="360" w:lineRule="auto"/>
+        <w:jc w:val="both"/>
+        <w:rPr>
+          <w:rFonts w:ascii="Times New Roman" w:cs="Times New Roman" w:eastAsia="Times New Roman" w:hAnsi="Times New Roman"/>
+          <w:sz w:val="24"/>
+          <w:szCs w:val="24"/>
+        </w:rPr>
+      </w:pPr>
+      <w:r>
+        <w:br w:type="page"/>
+      </w:r>
+      <w:r>
+        <w:rPr>
+          <w:rtl w:val="0"/>
+        </w:rPr>
+      </w:r>
+    </w:p>
+    <w:p>
+      <w:pPr>
+        <w:spacing w:after="200" w:line="360" w:lineRule="auto"/>
+        <w:jc w:val="center"/>
+        <w:rPr>
+          <w:rFonts w:ascii="Times New Roman" w:cs="Times New Roman" w:eastAsia="Times New Roman" w:hAnsi="Times New Roman"/>
+          <w:sz w:val="24"/>
+          <w:szCs w:val="24"/>
+        </w:rPr>
+      </w:pPr>
+      <w:r>
+        <w:rPr>
+          <w:rFonts w:ascii="Times New Roman" w:cs="Times New Roman" w:eastAsia="Times New Roman" w:hAnsi="Times New Roman"/>
+          <w:sz w:val="24"/>
+          <w:szCs w:val="24"/>
+          <w:rtl w:val="0"/>
+        </w:rPr>
+        <w:t xml:space="preserve">LISTA DE ABREVIATURAS E SIGLAS</w:t>
+      </w:r>
+    </w:p>
+    <w:p>
+      <w:pPr>
+        <w:spacing w:after="0" w:line="360" w:lineRule="auto"/>
+        <w:rPr>
+          <w:rFonts w:ascii="Times New Roman" w:cs="Times New Roman" w:eastAsia="Times New Roman" w:hAnsi="Times New Roman"/>
+          <w:sz w:val="24"/>
+          <w:szCs w:val="24"/>
+        </w:rPr>
+      </w:pPr>
+      <w:r>
+        <w:rPr>
+          <w:rFonts w:ascii="Times New Roman" w:cs="Times New Roman" w:eastAsia="Times New Roman" w:hAnsi="Times New Roman"/>
+          <w:sz w:val="24"/>
+          <w:szCs w:val="24"/>
+          <w:rtl w:val="0"/>
+        </w:rPr>
+        <w:t xml:space="preserve">ABNT - Associação Brasileira de Normas Técnicas</w:t>
+      </w:r>
+    </w:p>
+    <w:p>
+      <w:pPr>
+        <w:spacing w:after="0" w:line="360" w:lineRule="auto"/>
+        <w:jc w:val="both"/>
+        <w:rPr>
+          <w:rFonts w:ascii="Times New Roman" w:cs="Times New Roman" w:eastAsia="Times New Roman" w:hAnsi="Times New Roman"/>
+          <w:sz w:val="24"/>
+          <w:szCs w:val="24"/>
+        </w:rPr>
+      </w:pPr>
+      <w:r>
+        <w:rPr>
+          <w:rFonts w:ascii="Times New Roman" w:cs="Times New Roman" w:eastAsia="Times New Roman" w:hAnsi="Times New Roman"/>
+          <w:sz w:val="24"/>
+          <w:szCs w:val="24"/>
+          <w:rtl w:val="0"/>
+        </w:rPr>
+        <w:t xml:space="preserve">ADC - Analog-to-Digital Converter</w:t>
+      </w:r>
+    </w:p>
+    <w:p>
+      <w:pPr>
+        <w:spacing w:after="0" w:line="360" w:lineRule="auto"/>
+        <w:jc w:val="both"/>
+        <w:rPr>
+          <w:rFonts w:ascii="Times New Roman" w:cs="Times New Roman" w:eastAsia="Times New Roman" w:hAnsi="Times New Roman"/>
+          <w:sz w:val="24"/>
+          <w:szCs w:val="24"/>
+        </w:rPr>
+      </w:pPr>
+      <w:r>
+        <w:rPr>
+          <w:rFonts w:ascii="Times New Roman" w:cs="Times New Roman" w:eastAsia="Times New Roman" w:hAnsi="Times New Roman"/>
+          <w:sz w:val="24"/>
+          <w:szCs w:val="24"/>
+          <w:rtl w:val="0"/>
+        </w:rPr>
+        <w:t xml:space="preserve">IDE - Integrated Development Environment</w:t>
+      </w:r>
+    </w:p>
+    <w:p>
+      <w:pPr>
+        <w:spacing w:after="0" w:line="360" w:lineRule="auto"/>
+        <w:jc w:val="both"/>
+        <w:rPr>
+          <w:rFonts w:ascii="Times New Roman" w:cs="Times New Roman" w:eastAsia="Times New Roman" w:hAnsi="Times New Roman"/>
+          <w:sz w:val="24"/>
+          <w:szCs w:val="24"/>
+        </w:rPr>
+      </w:pPr>
+      <w:r>
+        <w:rPr>
+          <w:rFonts w:ascii="Times New Roman" w:cs="Times New Roman" w:eastAsia="Times New Roman" w:hAnsi="Times New Roman"/>
+          <w:sz w:val="24"/>
+          <w:szCs w:val="24"/>
+          <w:rtl w:val="0"/>
+        </w:rPr>
+        <w:t xml:space="preserve">IFMG-SJE - Instituto Federal de Minas Gerais - Campus São João Evangelista</w:t>
+      </w:r>
+    </w:p>
+    <w:p>
+      <w:pPr>
+        <w:spacing w:after="0" w:line="360" w:lineRule="auto"/>
+        <w:jc w:val="both"/>
+        <w:rPr>
+          <w:rFonts w:ascii="Times New Roman" w:cs="Times New Roman" w:eastAsia="Times New Roman" w:hAnsi="Times New Roman"/>
+          <w:sz w:val="24"/>
+          <w:szCs w:val="24"/>
+        </w:rPr>
+      </w:pPr>
+      <w:r>
+        <w:rPr>
+          <w:rFonts w:ascii="Times New Roman" w:cs="Times New Roman" w:eastAsia="Times New Roman" w:hAnsi="Times New Roman"/>
+          <w:sz w:val="24"/>
+          <w:szCs w:val="24"/>
+          <w:rtl w:val="0"/>
+        </w:rPr>
+        <w:t xml:space="preserve">I2C - Inter-Integrated Circuit</w:t>
+      </w:r>
+    </w:p>
+    <w:p>
+      <w:pPr>
+        <w:spacing w:after="0" w:line="360" w:lineRule="auto"/>
+        <w:jc w:val="both"/>
+        <w:rPr>
+          <w:rFonts w:ascii="Times New Roman" w:cs="Times New Roman" w:eastAsia="Times New Roman" w:hAnsi="Times New Roman"/>
+          <w:sz w:val="24"/>
+          <w:szCs w:val="24"/>
+        </w:rPr>
+      </w:pPr>
+      <w:r>
+        <w:rPr>
+          <w:rFonts w:ascii="Times New Roman" w:cs="Times New Roman" w:eastAsia="Times New Roman" w:hAnsi="Times New Roman"/>
+          <w:sz w:val="24"/>
+          <w:szCs w:val="24"/>
+          <w:rtl w:val="0"/>
+        </w:rPr>
+        <w:t xml:space="preserve">LCD - Liquid Crystal Display</w:t>
+      </w:r>
+    </w:p>
+    <w:p>
+      <w:pPr>
+        <w:spacing w:after="0" w:line="360" w:lineRule="auto"/>
+        <w:jc w:val="both"/>
+        <w:rPr>
+          <w:rFonts w:ascii="Times New Roman" w:cs="Times New Roman" w:eastAsia="Times New Roman" w:hAnsi="Times New Roman"/>
+          <w:sz w:val="24"/>
+          <w:szCs w:val="24"/>
+        </w:rPr>
+      </w:pPr>
+      <w:r>
+        <w:rPr>
+          <w:rFonts w:ascii="Times New Roman" w:cs="Times New Roman" w:eastAsia="Times New Roman" w:hAnsi="Times New Roman"/>
+          <w:sz w:val="24"/>
+          <w:szCs w:val="24"/>
+          <w:rtl w:val="0"/>
+        </w:rPr>
+        <w:t xml:space="preserve">LED - Light Emitting Diode</w:t>
+      </w:r>
+    </w:p>
+    <w:p>
+      <w:pPr>
+        <w:spacing w:after="0" w:line="360" w:lineRule="auto"/>
+        <w:jc w:val="both"/>
+        <w:rPr>
+          <w:rFonts w:ascii="Times New Roman" w:cs="Times New Roman" w:eastAsia="Times New Roman" w:hAnsi="Times New Roman"/>
+          <w:sz w:val="24"/>
+          <w:szCs w:val="24"/>
+        </w:rPr>
+      </w:pPr>
+      <w:r>
+        <w:rPr>
+          <w:rFonts w:ascii="Times New Roman" w:cs="Times New Roman" w:eastAsia="Times New Roman" w:hAnsi="Times New Roman"/>
+          <w:sz w:val="24"/>
+          <w:szCs w:val="24"/>
+          <w:rtl w:val="0"/>
+        </w:rPr>
+        <w:t xml:space="preserve">LPM - Litros por Minuto</w:t>
+      </w:r>
+    </w:p>
+    <w:p>
+      <w:pPr>
+        <w:spacing w:after="0" w:line="360" w:lineRule="auto"/>
+        <w:jc w:val="both"/>
+        <w:rPr>
+          <w:rFonts w:ascii="Times New Roman" w:cs="Times New Roman" w:eastAsia="Times New Roman" w:hAnsi="Times New Roman"/>
+          <w:sz w:val="24"/>
+          <w:szCs w:val="24"/>
+        </w:rPr>
+      </w:pPr>
+      <w:r>
+        <w:rPr>
+          <w:rFonts w:ascii="Times New Roman" w:cs="Times New Roman" w:eastAsia="Times New Roman" w:hAnsi="Times New Roman"/>
+          <w:sz w:val="24"/>
+          <w:szCs w:val="24"/>
+          <w:rtl w:val="0"/>
+        </w:rPr>
+        <w:t xml:space="preserve">NR-12 - Norma Regulamentadora 12</w:t>
+      </w:r>
+    </w:p>
+    <w:p>
+      <w:pPr>
+        <w:spacing w:after="0" w:line="360" w:lineRule="auto"/>
+        <w:jc w:val="both"/>
+        <w:rPr>
+          <w:rFonts w:ascii="Times New Roman" w:cs="Times New Roman" w:eastAsia="Times New Roman" w:hAnsi="Times New Roman"/>
+          <w:sz w:val="24"/>
+          <w:szCs w:val="24"/>
+        </w:rPr>
+      </w:pPr>
+      <w:r>
+        <w:rPr>
+          <w:rFonts w:ascii="Times New Roman" w:cs="Times New Roman" w:eastAsia="Times New Roman" w:hAnsi="Times New Roman"/>
+          <w:sz w:val="24"/>
+          <w:szCs w:val="24"/>
+          <w:rtl w:val="0"/>
+        </w:rPr>
+        <w:t xml:space="preserve">PSI - Pounds per Square Inch</w:t>
+      </w:r>
+    </w:p>
+    <w:p>
+      <w:pPr>
+        <w:spacing w:after="0" w:line="360" w:lineRule="auto"/>
+        <w:jc w:val="left"/>
+        <w:rPr>
+          <w:rFonts w:ascii="Times New Roman" w:cs="Times New Roman" w:eastAsia="Times New Roman" w:hAnsi="Times New Roman"/>
+          <w:sz w:val="24"/>
+          <w:szCs w:val="24"/>
+        </w:rPr>
+      </w:pPr>
+      <w:r>
+        <w:br w:type="page"/>
+      </w:r>
+      <w:r>
+        <w:rPr>
+          <w:rtl w:val="0"/>
+        </w:rPr>
+      </w:r>
+    </w:p>
+    <w:p>
+      <w:pPr>
+        <w:spacing w:after="360" w:line="360" w:lineRule="auto"/>
+        <w:jc w:val="center"/>
+        <w:rPr>
+          <w:rFonts w:ascii="Times New Roman" w:cs="Times New Roman" w:eastAsia="Times New Roman" w:hAnsi="Times New Roman"/>
+          <w:sz w:val="26"/>
+          <w:szCs w:val="26"/>
+        </w:rPr>
+      </w:pPr>
+      <w:r>
+        <w:rPr>
+          <w:rFonts w:ascii="Times New Roman" w:cs="Times New Roman" w:eastAsia="Times New Roman" w:hAnsi="Times New Roman"/>
+          <w:b w:val="1"/>
+          <w:bCs w:val="1"/>
+          <w:sz w:val="24"/>
+          <w:szCs w:val="24"/>
+          <w:rtl w:val="0"/>
+        </w:rPr>
+        <w:t xml:space="preserve">SUMÁRIO</w:t>
+      </w:r>
+      <w:r>
+        <w:rPr>
+          <w:rtl w:val="0"/>
+        </w:rPr>
+      </w:r>
+    </w:p>
+    <w:sdt>
+      <w:sdtPr>
+        <w:id w:val="1395935069"/>
         <w:docPartObj>
           <w:docPartGallery w:val="Table of Contents"/>
           <w:docPartUnique w:val="1"/>
@@ -3672,379 +4106,6 @@
           </w:pPr>
           <w:r>
             <w:fldChar w:fldCharType="begin"/>
-            <w:instrText xml:space="preserve"> TOC \h \u \z \t "Heading 4,1,Heading 5,5,"</w:instrText>
-            <w:fldChar w:fldCharType="separate"/>
-          </w:r>
-          <w:hyperlink w:anchor="_heading=h.hf9dm8okyz68">
-            <w:r>
-              <w:rPr>
-                <w:rFonts w:ascii="Times New Roman" w:cs="Times New Roman" w:eastAsia="Times New Roman" w:hAnsi="Times New Roman"/>
-                <w:b w:val="0"/>
-                <w:bCs w:val="0"/>
-                <w:i w:val="0"/>
-                <w:iCs w:val="0"/>
-                <w:smallCaps w:val="0"/>
-                <w:strike w:val="0"/>
-                <w:color w:val="000000"/>
-                <w:sz w:val="24"/>
-                <w:szCs w:val="24"/>
-                <w:u w:val="none"/>
-                <w:shd w:fill="auto" w:val="clear"/>
-                <w:vertAlign w:val="baseline"/>
-                <w:rtl w:val="0"/>
-              </w:rPr>
-              <w:t xml:space="preserve">Tabela 1 - Tabela da lista de materiais com valores</w:t>
-              <w:tab/>
-              <w:t xml:space="preserve">27</w:t>
-            </w:r>
-          </w:hyperlink>
-          <w:r>
-            <w:rPr>
-              <w:rtl w:val="0"/>
-            </w:rPr>
-          </w:r>
-          <w:r>
-            <w:fldChar w:fldCharType="end"/>
-          </w:r>
-        </w:p>
-      </w:sdtContent>
-    </w:sdt>
-    <w:p>
-      <w:pPr>
-        <w:spacing w:after="0" w:line="360" w:lineRule="auto"/>
-        <w:jc w:val="both"/>
-        <w:rPr>
-          <w:rFonts w:ascii="Times New Roman" w:cs="Times New Roman" w:eastAsia="Times New Roman" w:hAnsi="Times New Roman"/>
-          <w:b w:val="1"/>
-          <w:bCs w:val="1"/>
-          <w:sz w:val="24"/>
-          <w:szCs w:val="24"/>
-        </w:rPr>
-      </w:pPr>
-      <w:r>
-        <w:rPr>
-          <w:rtl w:val="0"/>
-        </w:rPr>
-      </w:r>
-    </w:p>
-    <w:p>
-      <w:pPr>
-        <w:spacing w:after="360" w:line="360" w:lineRule="auto"/>
-        <w:jc w:val="both"/>
-        <w:rPr>
-          <w:rFonts w:ascii="Times New Roman" w:cs="Times New Roman" w:eastAsia="Times New Roman" w:hAnsi="Times New Roman"/>
-          <w:sz w:val="24"/>
-          <w:szCs w:val="24"/>
-        </w:rPr>
-      </w:pPr>
-      <w:r>
-        <w:br w:type="page"/>
-      </w:r>
-      <w:r>
-        <w:rPr>
-          <w:rtl w:val="0"/>
-        </w:rPr>
-      </w:r>
-    </w:p>
-    <w:p>
-      <w:pPr>
-        <w:spacing w:after="200" w:line="360" w:lineRule="auto"/>
-        <w:jc w:val="center"/>
-        <w:rPr>
-          <w:rFonts w:ascii="Times New Roman" w:cs="Times New Roman" w:eastAsia="Times New Roman" w:hAnsi="Times New Roman"/>
-          <w:sz w:val="24"/>
-          <w:szCs w:val="24"/>
-        </w:rPr>
-      </w:pPr>
-      <w:r>
-        <w:rPr>
-          <w:rFonts w:ascii="Times New Roman" w:cs="Times New Roman" w:eastAsia="Times New Roman" w:hAnsi="Times New Roman"/>
-          <w:sz w:val="24"/>
-          <w:szCs w:val="24"/>
-          <w:rtl w:val="0"/>
-        </w:rPr>
-        <w:t xml:space="preserve">LISTA DE ABREVIATURAS E SIGLAS</w:t>
-      </w:r>
-    </w:p>
-    <w:p>
-      <w:pPr>
-        <w:spacing w:after="0" w:line="360" w:lineRule="auto"/>
-        <w:rPr>
-          <w:rFonts w:ascii="Times New Roman" w:cs="Times New Roman" w:eastAsia="Times New Roman" w:hAnsi="Times New Roman"/>
-          <w:sz w:val="24"/>
-          <w:szCs w:val="24"/>
-        </w:rPr>
-      </w:pPr>
-      <w:r>
-        <w:rPr>
-          <w:rFonts w:ascii="Times New Roman" w:cs="Times New Roman" w:eastAsia="Times New Roman" w:hAnsi="Times New Roman"/>
-          <w:sz w:val="24"/>
-          <w:szCs w:val="24"/>
-          <w:rtl w:val="0"/>
-        </w:rPr>
-        <w:t xml:space="preserve">ABNT - Associação Brasileira de Normas Técnicas</w:t>
-      </w:r>
-    </w:p>
-    <w:p>
-      <w:pPr>
-        <w:spacing w:after="0" w:line="360" w:lineRule="auto"/>
-        <w:jc w:val="both"/>
-        <w:rPr>
-          <w:rFonts w:ascii="Times New Roman" w:cs="Times New Roman" w:eastAsia="Times New Roman" w:hAnsi="Times New Roman"/>
-          <w:sz w:val="24"/>
-          <w:szCs w:val="24"/>
-        </w:rPr>
-      </w:pPr>
-      <w:r>
-        <w:rPr>
-          <w:rFonts w:ascii="Times New Roman" w:cs="Times New Roman" w:eastAsia="Times New Roman" w:hAnsi="Times New Roman"/>
-          <w:sz w:val="24"/>
-          <w:szCs w:val="24"/>
-          <w:rtl w:val="0"/>
-        </w:rPr>
-        <w:t xml:space="preserve">ADC - Analog-to-Digital Converter</w:t>
-      </w:r>
-    </w:p>
-    <w:p>
-      <w:pPr>
-        <w:spacing w:after="0" w:line="360" w:lineRule="auto"/>
-        <w:jc w:val="both"/>
-        <w:rPr>
-          <w:rFonts w:ascii="Times New Roman" w:cs="Times New Roman" w:eastAsia="Times New Roman" w:hAnsi="Times New Roman"/>
-          <w:sz w:val="24"/>
-          <w:szCs w:val="24"/>
-        </w:rPr>
-      </w:pPr>
-      <w:r>
-        <w:rPr>
-          <w:rFonts w:ascii="Times New Roman" w:cs="Times New Roman" w:eastAsia="Times New Roman" w:hAnsi="Times New Roman"/>
-          <w:sz w:val="24"/>
-          <w:szCs w:val="24"/>
-          <w:rtl w:val="0"/>
-        </w:rPr>
-        <w:t xml:space="preserve">IDE - Integrated Development Environment</w:t>
-      </w:r>
-    </w:p>
-    <w:p>
-      <w:pPr>
-        <w:spacing w:after="0" w:line="360" w:lineRule="auto"/>
-        <w:jc w:val="both"/>
-        <w:rPr>
-          <w:rFonts w:ascii="Times New Roman" w:cs="Times New Roman" w:eastAsia="Times New Roman" w:hAnsi="Times New Roman"/>
-          <w:sz w:val="24"/>
-          <w:szCs w:val="24"/>
-        </w:rPr>
-      </w:pPr>
-      <w:r>
-        <w:rPr>
-          <w:rFonts w:ascii="Times New Roman" w:cs="Times New Roman" w:eastAsia="Times New Roman" w:hAnsi="Times New Roman"/>
-          <w:sz w:val="24"/>
-          <w:szCs w:val="24"/>
-          <w:rtl w:val="0"/>
-        </w:rPr>
-        <w:t xml:space="preserve">IFMG-SJE - Instituto Federal de Minas Gerais - Campus São João Evangelista</w:t>
-      </w:r>
-    </w:p>
-    <w:p>
-      <w:pPr>
-        <w:spacing w:after="0" w:line="360" w:lineRule="auto"/>
-        <w:jc w:val="both"/>
-        <w:rPr>
-          <w:rFonts w:ascii="Times New Roman" w:cs="Times New Roman" w:eastAsia="Times New Roman" w:hAnsi="Times New Roman"/>
-          <w:sz w:val="24"/>
-          <w:szCs w:val="24"/>
-        </w:rPr>
-      </w:pPr>
-      <w:r>
-        <w:rPr>
-          <w:rFonts w:ascii="Times New Roman" w:cs="Times New Roman" w:eastAsia="Times New Roman" w:hAnsi="Times New Roman"/>
-          <w:sz w:val="24"/>
-          <w:szCs w:val="24"/>
-          <w:rtl w:val="0"/>
-        </w:rPr>
-        <w:t xml:space="preserve">I2C - Inter-Integrated Circuit</w:t>
-      </w:r>
-    </w:p>
-    <w:p>
-      <w:pPr>
-        <w:spacing w:after="0" w:line="360" w:lineRule="auto"/>
-        <w:jc w:val="both"/>
-        <w:rPr>
-          <w:rFonts w:ascii="Times New Roman" w:cs="Times New Roman" w:eastAsia="Times New Roman" w:hAnsi="Times New Roman"/>
-          <w:sz w:val="24"/>
-          <w:szCs w:val="24"/>
-        </w:rPr>
-      </w:pPr>
-      <w:r>
-        <w:rPr>
-          <w:rFonts w:ascii="Times New Roman" w:cs="Times New Roman" w:eastAsia="Times New Roman" w:hAnsi="Times New Roman"/>
-          <w:sz w:val="24"/>
-          <w:szCs w:val="24"/>
-          <w:rtl w:val="0"/>
-        </w:rPr>
-        <w:t xml:space="preserve">LCD - Liquid Crystal Display</w:t>
-      </w:r>
-    </w:p>
-    <w:p>
-      <w:pPr>
-        <w:spacing w:after="0" w:line="360" w:lineRule="auto"/>
-        <w:jc w:val="both"/>
-        <w:rPr>
-          <w:rFonts w:ascii="Times New Roman" w:cs="Times New Roman" w:eastAsia="Times New Roman" w:hAnsi="Times New Roman"/>
-          <w:sz w:val="24"/>
-          <w:szCs w:val="24"/>
-        </w:rPr>
-      </w:pPr>
-      <w:r>
-        <w:rPr>
-          <w:rFonts w:ascii="Times New Roman" w:cs="Times New Roman" w:eastAsia="Times New Roman" w:hAnsi="Times New Roman"/>
-          <w:sz w:val="24"/>
-          <w:szCs w:val="24"/>
-          <w:rtl w:val="0"/>
-        </w:rPr>
-        <w:t xml:space="preserve">LED - Light Emitting Diode</w:t>
-      </w:r>
-    </w:p>
-    <w:p>
-      <w:pPr>
-        <w:spacing w:after="0" w:line="360" w:lineRule="auto"/>
-        <w:jc w:val="both"/>
-        <w:rPr>
-          <w:rFonts w:ascii="Times New Roman" w:cs="Times New Roman" w:eastAsia="Times New Roman" w:hAnsi="Times New Roman"/>
-          <w:sz w:val="24"/>
-          <w:szCs w:val="24"/>
-        </w:rPr>
-      </w:pPr>
-      <w:r>
-        <w:rPr>
-          <w:rFonts w:ascii="Times New Roman" w:cs="Times New Roman" w:eastAsia="Times New Roman" w:hAnsi="Times New Roman"/>
-          <w:sz w:val="24"/>
-          <w:szCs w:val="24"/>
-          <w:rtl w:val="0"/>
-        </w:rPr>
-        <w:t xml:space="preserve">LPM - Litros por Minuto</w:t>
-      </w:r>
-    </w:p>
-    <w:p>
-      <w:pPr>
-        <w:spacing w:after="0" w:line="360" w:lineRule="auto"/>
-        <w:jc w:val="both"/>
-        <w:rPr>
-          <w:rFonts w:ascii="Times New Roman" w:cs="Times New Roman" w:eastAsia="Times New Roman" w:hAnsi="Times New Roman"/>
-          <w:sz w:val="24"/>
-          <w:szCs w:val="24"/>
-        </w:rPr>
-      </w:pPr>
-      <w:r>
-        <w:rPr>
-          <w:rFonts w:ascii="Times New Roman" w:cs="Times New Roman" w:eastAsia="Times New Roman" w:hAnsi="Times New Roman"/>
-          <w:sz w:val="24"/>
-          <w:szCs w:val="24"/>
-          <w:rtl w:val="0"/>
-        </w:rPr>
-        <w:t xml:space="preserve">NR-12 - Norma Regulamentadora 12</w:t>
-      </w:r>
-    </w:p>
-    <w:p>
-      <w:pPr>
-        <w:spacing w:after="0" w:line="360" w:lineRule="auto"/>
-        <w:jc w:val="both"/>
-        <w:rPr>
-          <w:rFonts w:ascii="Times New Roman" w:cs="Times New Roman" w:eastAsia="Times New Roman" w:hAnsi="Times New Roman"/>
-          <w:sz w:val="24"/>
-          <w:szCs w:val="24"/>
-        </w:rPr>
-      </w:pPr>
-      <w:r>
-        <w:rPr>
-          <w:rFonts w:ascii="Times New Roman" w:cs="Times New Roman" w:eastAsia="Times New Roman" w:hAnsi="Times New Roman"/>
-          <w:sz w:val="24"/>
-          <w:szCs w:val="24"/>
-          <w:rtl w:val="0"/>
-        </w:rPr>
-        <w:t xml:space="preserve">PSI - Pounds per Square Inch</w:t>
-      </w:r>
-    </w:p>
-    <w:p>
-      <w:pPr>
-        <w:spacing w:after="0" w:line="360" w:lineRule="auto"/>
-        <w:jc w:val="left"/>
-        <w:rPr>
-          <w:rFonts w:ascii="Times New Roman" w:cs="Times New Roman" w:eastAsia="Times New Roman" w:hAnsi="Times New Roman"/>
-          <w:sz w:val="24"/>
-          <w:szCs w:val="24"/>
-        </w:rPr>
-      </w:pPr>
-      <w:r>
-        <w:br w:type="page"/>
-      </w:r>
-      <w:r>
-        <w:rPr>
-          <w:rtl w:val="0"/>
-        </w:rPr>
-      </w:r>
-    </w:p>
-    <w:p>
-      <w:pPr>
-        <w:spacing w:after="360" w:line="360" w:lineRule="auto"/>
-        <w:jc w:val="center"/>
-        <w:rPr>
-          <w:rFonts w:ascii="Times New Roman" w:cs="Times New Roman" w:eastAsia="Times New Roman" w:hAnsi="Times New Roman"/>
-          <w:sz w:val="26"/>
-          <w:szCs w:val="26"/>
-        </w:rPr>
-      </w:pPr>
-      <w:r>
-        <w:rPr>
-          <w:rFonts w:ascii="Times New Roman" w:cs="Times New Roman" w:eastAsia="Times New Roman" w:hAnsi="Times New Roman"/>
-          <w:b w:val="1"/>
-          <w:bCs w:val="1"/>
-          <w:sz w:val="24"/>
-          <w:szCs w:val="24"/>
-          <w:rtl w:val="0"/>
-        </w:rPr>
-        <w:t xml:space="preserve">SUMÁRIO</w:t>
-      </w:r>
-      <w:r>
-        <w:rPr>
-          <w:rtl w:val="0"/>
-        </w:rPr>
-      </w:r>
-    </w:p>
-    <w:sdt>
-      <w:sdtPr>
-        <w:id w:val="-1792228782"/>
-        <w:docPartObj>
-          <w:docPartGallery w:val="Table of Contents"/>
-          <w:docPartUnique w:val="1"/>
-        </w:docPartObj>
-      </w:sdtPr>
-      <w:sdtContent>
-        <w:p>
-          <w:pPr>
-            <w:widowControl w:val="0"/>
-            <w:tabs>
-              <w:tab w:val="right" w:leader="dot" w:pos="12000"/>
-            </w:tabs>
-            <w:spacing w:before="60" w:line="360" w:lineRule="auto"/>
-            <w:rPr>
-              <w:rFonts w:ascii="Arial" w:cs="Arial" w:eastAsia="Arial" w:hAnsi="Arial"/>
-              <w:b w:val="1"/>
-              <w:bCs w:val="1"/>
-              <w:i w:val="0"/>
-              <w:iCs w:val="0"/>
-              <w:smallCaps w:val="0"/>
-              <w:strike w:val="0"/>
-              <w:color w:val="000000"/>
-              <w:sz w:val="24"/>
-              <w:szCs w:val="24"/>
-              <w:u w:val="none"/>
-              <w:shd w:fill="auto" w:val="clear"/>
-              <w:vertAlign w:val="baseline"/>
-            </w:rPr>
-          </w:pPr>
-          <w:r>
-            <w:fldChar w:fldCharType="begin"/>
             <w:instrText xml:space="preserve"> TOC \h \u \z \t "Heading 1,1,Heading 2,1,Heading 3,1,Heading 5,5,"</w:instrText>
             <w:fldChar w:fldCharType="separate"/>
           </w:r>
@@ -4068,7 +4129,7 @@
               </w:rPr>
               <w:t xml:space="preserve">1. INTRODUÇÃO</w:t>
               <w:tab/>
-              <w:t xml:space="preserve">14</w:t>
+              <w:t xml:space="preserve">13</w:t>
             </w:r>
           </w:hyperlink>
           <w:r>
@@ -4093,8 +4154,8 @@
               <w:smallCaps w:val="0"/>
               <w:strike w:val="0"/>
               <w:color w:val="000000"/>
-              <w:sz w:val="24"/>
-              <w:szCs w:val="24"/>
+              <w:sz w:val="22"/>
+              <w:szCs w:val="22"/>
               <w:u w:val="none"/>
               <w:shd w:fill="auto" w:val="clear"/>
               <w:vertAlign w:val="baseline"/>
@@ -4120,7 +4181,7 @@
               </w:rPr>
               <w:t xml:space="preserve">1.1 Delimitação do Tema</w:t>
               <w:tab/>
-              <w:t xml:space="preserve">14</w:t>
+              <w:t xml:space="preserve">13</w:t>
             </w:r>
           </w:hyperlink>
           <w:r>
@@ -4145,8 +4206,8 @@
               <w:smallCaps w:val="0"/>
               <w:strike w:val="0"/>
               <w:color w:val="000000"/>
-              <w:sz w:val="24"/>
-              <w:szCs w:val="24"/>
+              <w:sz w:val="22"/>
+              <w:szCs w:val="22"/>
               <w:u w:val="none"/>
               <w:shd w:fill="auto" w:val="clear"/>
               <w:vertAlign w:val="baseline"/>
@@ -4172,7 +4233,7 @@
               </w:rPr>
               <w:t xml:space="preserve">1.2 Problema</w:t>
               <w:tab/>
-              <w:t xml:space="preserve">14</w:t>
+              <w:t xml:space="preserve">13</w:t>
             </w:r>
           </w:hyperlink>
           <w:r>
@@ -4197,8 +4258,8 @@
               <w:smallCaps w:val="0"/>
               <w:strike w:val="0"/>
               <w:color w:val="000000"/>
-              <w:sz w:val="24"/>
-              <w:szCs w:val="24"/>
+              <w:sz w:val="22"/>
+              <w:szCs w:val="22"/>
               <w:u w:val="none"/>
               <w:shd w:fill="auto" w:val="clear"/>
               <w:vertAlign w:val="baseline"/>
@@ -4249,8 +4310,8 @@
               <w:smallCaps w:val="0"/>
               <w:strike w:val="0"/>
               <w:color w:val="000000"/>
-              <w:sz w:val="24"/>
-              <w:szCs w:val="24"/>
+              <w:sz w:val="22"/>
+              <w:szCs w:val="22"/>
               <w:u w:val="none"/>
               <w:shd w:fill="auto" w:val="clear"/>
               <w:vertAlign w:val="baseline"/>
@@ -4276,7 +4337,7 @@
               </w:rPr>
               <w:t xml:space="preserve">1.3.1 Objetivo Geral</w:t>
               <w:tab/>
-              <w:t xml:space="preserve">15</w:t>
+              <w:t xml:space="preserve">14</w:t>
             </w:r>
           </w:hyperlink>
           <w:r>
@@ -4301,8 +4362,8 @@
               <w:smallCaps w:val="0"/>
               <w:strike w:val="0"/>
               <w:color w:val="000000"/>
-              <w:sz w:val="24"/>
-              <w:szCs w:val="24"/>
+              <w:sz w:val="22"/>
+              <w:szCs w:val="22"/>
               <w:u w:val="none"/>
               <w:shd w:fill="auto" w:val="clear"/>
               <w:vertAlign w:val="baseline"/>
@@ -4353,8 +4414,8 @@
               <w:smallCaps w:val="0"/>
               <w:strike w:val="0"/>
               <w:color w:val="000000"/>
-              <w:sz w:val="24"/>
-              <w:szCs w:val="24"/>
+              <w:sz w:val="22"/>
+              <w:szCs w:val="22"/>
               <w:u w:val="none"/>
               <w:shd w:fill="auto" w:val="clear"/>
               <w:vertAlign w:val="baseline"/>
@@ -4405,8 +4466,8 @@
               <w:smallCaps w:val="0"/>
               <w:strike w:val="0"/>
               <w:color w:val="000000"/>
-              <w:sz w:val="24"/>
-              <w:szCs w:val="24"/>
+              <w:sz w:val="22"/>
+              <w:szCs w:val="22"/>
               <w:u w:val="none"/>
               <w:shd w:fill="auto" w:val="clear"/>
               <w:vertAlign w:val="baseline"/>
@@ -4457,8 +4518,8 @@
               <w:smallCaps w:val="0"/>
               <w:strike w:val="0"/>
               <w:color w:val="000000"/>
-              <w:sz w:val="24"/>
-              <w:szCs w:val="24"/>
+              <w:sz w:val="22"/>
+              <w:szCs w:val="22"/>
               <w:u w:val="none"/>
               <w:shd w:fill="auto" w:val="clear"/>
               <w:vertAlign w:val="baseline"/>
@@ -4509,8 +4570,8 @@
               <w:smallCaps w:val="0"/>
               <w:strike w:val="0"/>
               <w:color w:val="000000"/>
-              <w:sz w:val="24"/>
-              <w:szCs w:val="24"/>
+              <w:sz w:val="22"/>
+              <w:szCs w:val="22"/>
               <w:u w:val="none"/>
               <w:shd w:fill="auto" w:val="clear"/>
               <w:vertAlign w:val="baseline"/>
@@ -4561,8 +4622,8 @@
               <w:smallCaps w:val="0"/>
               <w:strike w:val="0"/>
               <w:color w:val="000000"/>
-              <w:sz w:val="24"/>
-              <w:szCs w:val="24"/>
+              <w:sz w:val="22"/>
+              <w:szCs w:val="22"/>
               <w:u w:val="none"/>
               <w:shd w:fill="auto" w:val="clear"/>
               <w:vertAlign w:val="baseline"/>
@@ -4613,8 +4674,8 @@
               <w:smallCaps w:val="0"/>
               <w:strike w:val="0"/>
               <w:color w:val="000000"/>
-              <w:sz w:val="24"/>
-              <w:szCs w:val="24"/>
+              <w:sz w:val="22"/>
+              <w:szCs w:val="22"/>
               <w:u w:val="none"/>
               <w:shd w:fill="auto" w:val="clear"/>
               <w:vertAlign w:val="baseline"/>
@@ -4665,8 +4726,8 @@
               <w:smallCaps w:val="0"/>
               <w:strike w:val="0"/>
               <w:color w:val="000000"/>
-              <w:sz w:val="24"/>
-              <w:szCs w:val="24"/>
+              <w:sz w:val="22"/>
+              <w:szCs w:val="22"/>
               <w:u w:val="none"/>
               <w:shd w:fill="auto" w:val="clear"/>
               <w:vertAlign w:val="baseline"/>
@@ -4717,8 +4778,8 @@
               <w:smallCaps w:val="0"/>
               <w:strike w:val="0"/>
               <w:color w:val="000000"/>
-              <w:sz w:val="24"/>
-              <w:szCs w:val="24"/>
+              <w:sz w:val="22"/>
+              <w:szCs w:val="22"/>
               <w:u w:val="none"/>
               <w:shd w:fill="auto" w:val="clear"/>
               <w:vertAlign w:val="baseline"/>
@@ -4769,8 +4830,8 @@
               <w:smallCaps w:val="0"/>
               <w:strike w:val="0"/>
               <w:color w:val="000000"/>
-              <w:sz w:val="24"/>
-              <w:szCs w:val="24"/>
+              <w:sz w:val="22"/>
+              <w:szCs w:val="22"/>
               <w:u w:val="none"/>
               <w:shd w:fill="auto" w:val="clear"/>
               <w:vertAlign w:val="baseline"/>
@@ -4821,8 +4882,8 @@
               <w:smallCaps w:val="0"/>
               <w:strike w:val="0"/>
               <w:color w:val="000000"/>
-              <w:sz w:val="24"/>
-              <w:szCs w:val="24"/>
+              <w:sz w:val="22"/>
+              <w:szCs w:val="22"/>
               <w:u w:val="none"/>
               <w:shd w:fill="auto" w:val="clear"/>
               <w:vertAlign w:val="baseline"/>
@@ -4873,8 +4934,8 @@
               <w:smallCaps w:val="0"/>
               <w:strike w:val="0"/>
               <w:color w:val="000000"/>
-              <w:sz w:val="24"/>
-              <w:szCs w:val="24"/>
+              <w:sz w:val="22"/>
+              <w:szCs w:val="22"/>
               <w:u w:val="none"/>
               <w:shd w:fill="auto" w:val="clear"/>
               <w:vertAlign w:val="baseline"/>
@@ -4925,8 +4986,8 @@
               <w:smallCaps w:val="0"/>
               <w:strike w:val="0"/>
               <w:color w:val="000000"/>
-              <w:sz w:val="24"/>
-              <w:szCs w:val="24"/>
+              <w:sz w:val="22"/>
+              <w:szCs w:val="22"/>
               <w:u w:val="none"/>
               <w:shd w:fill="auto" w:val="clear"/>
               <w:vertAlign w:val="baseline"/>
@@ -4977,8 +5038,8 @@
               <w:smallCaps w:val="0"/>
               <w:strike w:val="0"/>
               <w:color w:val="000000"/>
-              <w:sz w:val="24"/>
-              <w:szCs w:val="24"/>
+              <w:sz w:val="22"/>
+              <w:szCs w:val="22"/>
               <w:u w:val="none"/>
               <w:shd w:fill="auto" w:val="clear"/>
               <w:vertAlign w:val="baseline"/>
@@ -5029,8 +5090,8 @@
               <w:smallCaps w:val="0"/>
               <w:strike w:val="0"/>
               <w:color w:val="000000"/>
-              <w:sz w:val="24"/>
-              <w:szCs w:val="24"/>
+              <w:sz w:val="22"/>
+              <w:szCs w:val="22"/>
               <w:u w:val="none"/>
               <w:shd w:fill="auto" w:val="clear"/>
               <w:vertAlign w:val="baseline"/>
@@ -5081,8 +5142,8 @@
               <w:smallCaps w:val="0"/>
               <w:strike w:val="0"/>
               <w:color w:val="000000"/>
-              <w:sz w:val="24"/>
-              <w:szCs w:val="24"/>
+              <w:sz w:val="22"/>
+              <w:szCs w:val="22"/>
               <w:u w:val="none"/>
               <w:shd w:fill="auto" w:val="clear"/>
               <w:vertAlign w:val="baseline"/>
@@ -5133,8 +5194,8 @@
               <w:smallCaps w:val="0"/>
               <w:strike w:val="0"/>
               <w:color w:val="000000"/>
-              <w:sz w:val="24"/>
-              <w:szCs w:val="24"/>
+              <w:sz w:val="22"/>
+              <w:szCs w:val="22"/>
               <w:u w:val="none"/>
               <w:shd w:fill="auto" w:val="clear"/>
               <w:vertAlign w:val="baseline"/>
@@ -5185,8 +5246,8 @@
               <w:smallCaps w:val="0"/>
               <w:strike w:val="0"/>
               <w:color w:val="000000"/>
-              <w:sz w:val="24"/>
-              <w:szCs w:val="24"/>
+              <w:sz w:val="22"/>
+              <w:szCs w:val="22"/>
               <w:u w:val="none"/>
               <w:shd w:fill="auto" w:val="clear"/>
               <w:vertAlign w:val="baseline"/>
@@ -5237,8 +5298,8 @@
               <w:smallCaps w:val="0"/>
               <w:strike w:val="0"/>
               <w:color w:val="000000"/>
-              <w:sz w:val="24"/>
-              <w:szCs w:val="24"/>
+              <w:sz w:val="22"/>
+              <w:szCs w:val="22"/>
               <w:u w:val="none"/>
               <w:shd w:fill="auto" w:val="clear"/>
               <w:vertAlign w:val="baseline"/>
@@ -5289,8 +5350,8 @@
               <w:smallCaps w:val="0"/>
               <w:strike w:val="0"/>
               <w:color w:val="000000"/>
-              <w:sz w:val="24"/>
-              <w:szCs w:val="24"/>
+              <w:sz w:val="22"/>
+              <w:szCs w:val="22"/>
               <w:u w:val="none"/>
               <w:shd w:fill="auto" w:val="clear"/>
               <w:vertAlign w:val="baseline"/>
@@ -5341,8 +5402,8 @@
               <w:smallCaps w:val="0"/>
               <w:strike w:val="0"/>
               <w:color w:val="000000"/>
-              <w:sz w:val="24"/>
-              <w:szCs w:val="24"/>
+              <w:sz w:val="22"/>
+              <w:szCs w:val="22"/>
               <w:u w:val="none"/>
               <w:shd w:fill="auto" w:val="clear"/>
               <w:vertAlign w:val="baseline"/>
@@ -5393,8 +5454,8 @@
               <w:smallCaps w:val="0"/>
               <w:strike w:val="0"/>
               <w:color w:val="000000"/>
-              <w:sz w:val="24"/>
-              <w:szCs w:val="24"/>
+              <w:sz w:val="22"/>
+              <w:szCs w:val="22"/>
               <w:u w:val="none"/>
               <w:shd w:fill="auto" w:val="clear"/>
               <w:vertAlign w:val="baseline"/>
@@ -5445,8 +5506,8 @@
               <w:smallCaps w:val="0"/>
               <w:strike w:val="0"/>
               <w:color w:val="000000"/>
-              <w:sz w:val="24"/>
-              <w:szCs w:val="24"/>
+              <w:sz w:val="22"/>
+              <w:szCs w:val="22"/>
               <w:u w:val="none"/>
               <w:shd w:fill="auto" w:val="clear"/>
               <w:vertAlign w:val="baseline"/>
@@ -5497,8 +5558,8 @@
               <w:smallCaps w:val="0"/>
               <w:strike w:val="0"/>
               <w:color w:val="000000"/>
-              <w:sz w:val="24"/>
-              <w:szCs w:val="24"/>
+              <w:sz w:val="22"/>
+              <w:szCs w:val="22"/>
               <w:u w:val="none"/>
               <w:shd w:fill="auto" w:val="clear"/>
               <w:vertAlign w:val="baseline"/>
@@ -5549,8 +5610,8 @@
               <w:smallCaps w:val="0"/>
               <w:strike w:val="0"/>
               <w:color w:val="000000"/>
-              <w:sz w:val="24"/>
-              <w:szCs w:val="24"/>
+              <w:sz w:val="22"/>
+              <w:szCs w:val="22"/>
               <w:u w:val="none"/>
               <w:shd w:fill="auto" w:val="clear"/>
               <w:vertAlign w:val="baseline"/>
@@ -5601,8 +5662,8 @@
               <w:smallCaps w:val="0"/>
               <w:strike w:val="0"/>
               <w:color w:val="000000"/>
-              <w:sz w:val="24"/>
-              <w:szCs w:val="24"/>
+              <w:sz w:val="22"/>
+              <w:szCs w:val="22"/>
               <w:u w:val="none"/>
               <w:shd w:fill="auto" w:val="clear"/>
               <w:vertAlign w:val="baseline"/>
@@ -5653,8 +5714,8 @@
               <w:smallCaps w:val="0"/>
               <w:strike w:val="0"/>
               <w:color w:val="000000"/>
-              <w:sz w:val="24"/>
-              <w:szCs w:val="24"/>
+              <w:sz w:val="22"/>
+              <w:szCs w:val="22"/>
               <w:u w:val="none"/>
               <w:shd w:fill="auto" w:val="clear"/>
               <w:vertAlign w:val="baseline"/>
@@ -5680,7 +5741,7 @@
               </w:rPr>
               <w:t xml:space="preserve">6. CONCLUSÃO</w:t>
               <w:tab/>
-              <w:t xml:space="preserve">32</w:t>
+              <w:t xml:space="preserve">31</w:t>
             </w:r>
           </w:hyperlink>
           <w:r>
@@ -5705,8 +5766,8 @@
               <w:smallCaps w:val="0"/>
               <w:strike w:val="0"/>
               <w:color w:val="000000"/>
-              <w:sz w:val="24"/>
-              <w:szCs w:val="24"/>
+              <w:sz w:val="22"/>
+              <w:szCs w:val="22"/>
               <w:u w:val="none"/>
               <w:shd w:fill="auto" w:val="clear"/>
               <w:vertAlign w:val="baseline"/>
@@ -5732,7 +5793,7 @@
               </w:rPr>
               <w:t xml:space="preserve">REFERÊNCIAS</w:t>
               <w:tab/>
-              <w:t xml:space="preserve">33</w:t>
+              <w:t xml:space="preserve">32</w:t>
             </w:r>
           </w:hyperlink>
           <w:r>
@@ -5908,7 +5969,21 @@
     <w:p>
       <w:pPr>
         <w:spacing w:after="0" w:before="0" w:line="360" w:lineRule="auto"/>
-        <w:ind w:left="0" w:firstLine="0"/>
+        <w:ind w:firstLine="720"/>
+        <w:jc w:val="both"/>
+        <w:rPr/>
+      </w:pPr>
+      <w:r>
+        <w:rPr>
+          <w:rtl w:val="0"/>
+        </w:rPr>
+        <w:t xml:space="preserve">A execução deste projeto é limitada pelos componentes ofertados pela instituição, configurando o sistema como um protótipo de prova de conceito. Consequentemente, variáveis como a precisão do volume envasado e a velocidade de resposta estão condicionadas a esse hardware específico. Desse modo, o escopo concentra-se essencialmente no desenvolvimento do software de controle e na validação da lógica de automação.</w:t>
+      </w:r>
+    </w:p>
+    <w:p>
+      <w:pPr>
+        <w:spacing w:after="0" w:before="0" w:line="360" w:lineRule="auto"/>
+        <w:ind w:firstLine="720"/>
         <w:jc w:val="both"/>
         <w:rPr/>
       </w:pPr>
@@ -5989,6 +6064,90 @@
     <w:p>
       <w:pPr>
         <w:spacing w:after="0" w:before="0" w:line="360" w:lineRule="auto"/>
+        <w:ind w:firstLine="720"/>
+        <w:jc w:val="both"/>
+        <w:rPr/>
+      </w:pPr>
+      <w:r>
+        <w:rPr>
+          <w:rtl w:val="0"/>
+        </w:rPr>
+        <w:t xml:space="preserve">No processo atual, evidencia-se um impacto financeiro gerado pela superdosagem das embalagens. Para evitar lesar o consumidor, a produção adota uma margem de erro para cima (fenômeno conhecido na indústria como </w:t>
+      </w:r>
+      <w:r>
+        <w:rPr>
+          <w:i w:val="1"/>
+          <w:iCs w:val="1"/>
+          <w:rtl w:val="0"/>
+        </w:rPr>
+        <w:t xml:space="preserve">giveaway </w:t>
+      </w:r>
+      <w:r>
+        <w:rPr>
+          <w:rtl w:val="0"/>
+        </w:rPr>
+        <w:t xml:space="preserve">ou sobrepeso), acarretando em uma quantidade excedente de produto que não foi contabilizada no preço de venda. Somado a isso, as ineficiências de tempo, os gargalos e o desperdício provocado por derramamentos representam custos embutidos que corroem a margem de lucro, limitando a capacidade de expansão e a competitividade do setor.</w:t>
+      </w:r>
+    </w:p>
+    <w:p>
+      <w:pPr>
+        <w:spacing w:after="0" w:before="0" w:line="360" w:lineRule="auto"/>
+        <w:ind w:firstLine="720"/>
+        <w:jc w:val="both"/>
+        <w:rPr/>
+      </w:pPr>
+      <w:r>
+        <w:rPr>
+          <w:rtl w:val="0"/>
+        </w:rPr>
+        <w:t xml:space="preserve">Outro fator oneroso do processo atual é o gargalo provocado pela alocação da mão de obra. O tempo gasto por colaboradores envasando e conferindo individualmente cada recipiente poderia ser redirecionado para etapas que exigem maior tomada de decisão e controle de qualidade. Além disso, deve-se considerar o fator humano: ao longo da jornada de trabalho, a fadiga aumenta, o que resulta na perda de produtividade e eleva a margem de erros na linha de produção.</w:t>
+      </w:r>
+    </w:p>
+    <w:p>
+      <w:pPr>
+        <w:spacing w:after="0" w:before="0" w:line="360" w:lineRule="auto"/>
+        <w:ind w:firstLine="720"/>
+        <w:jc w:val="both"/>
+        <w:rPr/>
+      </w:pPr>
+      <w:r>
+        <w:rPr>
+          <w:rtl w:val="0"/>
+        </w:rPr>
+        <w:t xml:space="preserve">Para contornar essas falhas, a implementação de um sistema microcontrolado ataca diretamente a raiz do desperdício por meio do rigor lógico do </w:t>
+      </w:r>
+      <w:r>
+        <w:rPr>
+          <w:i w:val="1"/>
+          <w:iCs w:val="1"/>
+          <w:rtl w:val="0"/>
+        </w:rPr>
+        <w:t xml:space="preserve">software</w:t>
+      </w:r>
+      <w:r>
+        <w:rPr>
+          <w:rtl w:val="0"/>
+        </w:rPr>
+        <w:t xml:space="preserve">. Ao empregar microcontroladores para gerenciar variáveis como o tempo de acionamento das bombas e a leitura de sensores, o sistema garante uma repetibilidade inatingível pela operação manual. Isso assegura a dosagem exata sem superdosagens, mitigando drasticamente o </w:t>
+      </w:r>
+      <w:r>
+        <w:rPr>
+          <w:i w:val="1"/>
+          <w:iCs w:val="1"/>
+          <w:rtl w:val="0"/>
+        </w:rPr>
+        <w:t xml:space="preserve">giveaway </w:t>
+      </w:r>
+      <w:r>
+        <w:rPr>
+          <w:rtl w:val="0"/>
+        </w:rPr>
+        <w:t xml:space="preserve">e os derramamentos. Por utilizar componentes acessíveis, a solução exige baixo investimento inicial. Assim, a substituição do esforço físico pela rotina programada estabiliza o ciclo de envase, tornando o tempo de produção previsível e otimizando os custos operacionais de forma escalável.</w:t>
+      </w:r>
+    </w:p>
+    <w:p>
+      <w:pPr>
+        <w:spacing w:after="0" w:before="0" w:line="360" w:lineRule="auto"/>
         <w:ind w:left="0" w:firstLine="0"/>
         <w:jc w:val="both"/>
         <w:rPr/>
@@ -6042,12 +6201,14 @@
       </w:pPr>
       <w:r>
         <w:rPr>
-          <w:rFonts w:ascii="Times New Roman" w:cs="Times New Roman" w:eastAsia="Times New Roman" w:hAnsi="Times New Roman"/>
-          <w:sz w:val="24"/>
-          <w:szCs w:val="24"/>
-          <w:rtl w:val="0"/>
-        </w:rPr>
-        <w:t xml:space="preserve">Para resolver o problema do envase manual e alcançar a automação desejada, este projeto estabelece objetivos claros e específicos que guiarão o desenvolvimento e a avaliação do equipamento proposto. Eles servem como um roteiro para a pesquisa e a implementação, garantindo que a solução final atenda às necessidades da Agroindústria.</w:t>
+          <w:rtl w:val="0"/>
+        </w:rPr>
+        <w:t xml:space="preserve">Apresentam-se, a seguir, os objetivos geral e específicos que norteiam o desenvolvimento e a avaliação do sistema automatizado proposto para a Agroindústria.</w:t>
+      </w:r>
+      <w:r>
+        <w:rPr>
+          <w:rtl w:val="0"/>
+        </w:rPr>
       </w:r>
     </w:p>
     <w:p>
@@ -6107,12 +6268,14 @@
       </w:pPr>
       <w:r>
         <w:rPr>
-          <w:rFonts w:ascii="Times New Roman" w:cs="Times New Roman" w:eastAsia="Times New Roman" w:hAnsi="Times New Roman"/>
-          <w:sz w:val="24"/>
-          <w:szCs w:val="24"/>
-          <w:rtl w:val="0"/>
-        </w:rPr>
-        <w:t xml:space="preserve">O objetivo geral deste trabalho é conceber, desenvolver e implementar um equipamento automatizado para o envase de iogurte que otimize o processo de produção na Agroindústria do IFMG-SJE.</w:t>
+          <w:rtl w:val="0"/>
+        </w:rPr>
+        <w:t xml:space="preserve">Construir um sistema microcontrolado que automatize o processo de envase do iogurte produzido na Agroindústria do IFMG-SJE.</w:t>
+      </w:r>
+      <w:r>
+        <w:rPr>
+          <w:rtl w:val="0"/>
+        </w:rPr>
       </w:r>
     </w:p>
     <w:p>
@@ -6137,46 +6300,45 @@
         <w:jc w:val="both"/>
         <w:rPr>
           <w:rFonts w:ascii="Times New Roman" w:cs="Times New Roman" w:eastAsia="Times New Roman" w:hAnsi="Times New Roman"/>
-        </w:rPr>
-      </w:pPr>
-      <w:bookmarkStart w:colFirst="0" w:colLast="0" w:name="_heading=h.5n6be08yg6k9" w:id="18"/>
-      <w:bookmarkEnd w:id="18"/>
-      <w:r>
-        <w:rPr>
-          <w:rFonts w:ascii="Times New Roman" w:cs="Times New Roman" w:eastAsia="Times New Roman" w:hAnsi="Times New Roman"/>
           <w:b w:val="1"/>
           <w:bCs w:val="1"/>
           <w:color w:val="000000"/>
           <w:sz w:val="24"/>
           <w:szCs w:val="24"/>
+        </w:rPr>
+      </w:pPr>
+      <w:bookmarkStart w:colFirst="0" w:colLast="0" w:name="_heading=h.5n6be08yg6k9" w:id="18"/>
+      <w:bookmarkEnd w:id="18"/>
+      <w:r>
+        <w:rPr>
+          <w:rFonts w:ascii="Times New Roman" w:cs="Times New Roman" w:eastAsia="Times New Roman" w:hAnsi="Times New Roman"/>
+          <w:b w:val="1"/>
+          <w:bCs w:val="1"/>
+          <w:color w:val="000000"/>
+          <w:sz w:val="24"/>
+          <w:szCs w:val="24"/>
           <w:rtl w:val="0"/>
         </w:rPr>
         <w:t xml:space="preserve">1.3.2 Objetivos Específicos</w:t>
       </w:r>
-      <w:r>
-        <w:rPr>
-          <w:rtl w:val="0"/>
-        </w:rPr>
-      </w:r>
-    </w:p>
-    <w:p>
-      <w:pPr>
-        <w:spacing w:after="200" w:before="0" w:line="360" w:lineRule="auto"/>
+    </w:p>
+    <w:p>
+      <w:pPr>
+        <w:spacing w:after="0" w:line="360" w:lineRule="auto"/>
         <w:jc w:val="both"/>
-        <w:rPr>
-          <w:rFonts w:ascii="Times New Roman" w:cs="Times New Roman" w:eastAsia="Times New Roman" w:hAnsi="Times New Roman"/>
-          <w:sz w:val="24"/>
-          <w:szCs w:val="24"/>
-        </w:rPr>
-      </w:pPr>
-      <w:r>
-        <w:rPr>
-          <w:rFonts w:ascii="Times New Roman" w:cs="Times New Roman" w:eastAsia="Times New Roman" w:hAnsi="Times New Roman"/>
-          <w:sz w:val="24"/>
-          <w:szCs w:val="24"/>
-          <w:rtl w:val="0"/>
-        </w:rPr>
-        <w:t xml:space="preserve">Os objetivos específicos incluem:</w:t>
+        <w:rPr/>
+      </w:pPr>
+      <w:r>
+        <w:rPr>
+          <w:rtl w:val="0"/>
+        </w:rPr>
+        <w:tab/>
+        <w:t xml:space="preserve">Para alcançar o objetivo geral, definiram-se os seguintes objetivos específicos:</w:t>
+      </w:r>
+      <w:r>
+        <w:rPr>
+          <w:rtl w:val="0"/>
+        </w:rPr>
       </w:r>
     </w:p>
     <w:p>
@@ -6196,12 +6358,18 @@
       </w:pPr>
       <w:r>
         <w:rPr>
-          <w:rFonts w:ascii="Times New Roman" w:cs="Times New Roman" w:eastAsia="Times New Roman" w:hAnsi="Times New Roman"/>
-          <w:sz w:val="24"/>
-          <w:szCs w:val="24"/>
-          <w:rtl w:val="0"/>
-        </w:rPr>
-        <w:t xml:space="preserve">Reduzir a intervenção humana no processo de envase.</w:t>
+          <w:rtl w:val="0"/>
+        </w:rPr>
+        <w:t xml:space="preserve">Especificar e selecionar os componentes eletrônicos, sensores e atuadores necessários para a construção do protótipo, priorizando a compatibilidade com a plataforma Arduino e o critério de baixo custo</w:t>
+      </w:r>
+      <w:r>
+        <w:rPr>
+          <w:rFonts w:ascii="Times New Roman" w:cs="Times New Roman" w:eastAsia="Times New Roman" w:hAnsi="Times New Roman"/>
+          <w:sz w:val="24"/>
+          <w:szCs w:val="24"/>
+          <w:rtl w:val="0"/>
+        </w:rPr>
+        <w:t xml:space="preserve">.</w:t>
       </w:r>
     </w:p>
     <w:p>
@@ -6214,69 +6382,14 @@
         <w:ind w:left="720" w:hanging="360"/>
         <w:jc w:val="both"/>
         <w:rPr>
-          <w:rFonts w:ascii="Times New Roman" w:cs="Times New Roman" w:eastAsia="Times New Roman" w:hAnsi="Times New Roman"/>
-          <w:sz w:val="24"/>
-          <w:szCs w:val="24"/>
-        </w:rPr>
-      </w:pPr>
-      <w:r>
-        <w:rPr>
-          <w:rFonts w:ascii="Times New Roman" w:cs="Times New Roman" w:eastAsia="Times New Roman" w:hAnsi="Times New Roman"/>
-          <w:sz w:val="24"/>
-          <w:szCs w:val="24"/>
-          <w:rtl w:val="0"/>
-        </w:rPr>
-        <w:t xml:space="preserve">Garantir a precisão na dosagem do produto, evitando tanto o excesso quanto a falta de iogurte nas embalagens.</w:t>
-      </w:r>
-    </w:p>
-    <w:p>
-      <w:pPr>
-        <w:numPr>
-          <w:ilvl w:val="0"/>
-          <w:numId w:val="1"/>
-        </w:numPr>
-        <w:spacing w:after="200" w:before="0" w:line="360" w:lineRule="auto"/>
-        <w:ind w:left="720" w:hanging="360"/>
-        <w:jc w:val="both"/>
-        <w:rPr>
-          <w:rFonts w:ascii="Times New Roman" w:cs="Times New Roman" w:eastAsia="Times New Roman" w:hAnsi="Times New Roman"/>
-          <w:sz w:val="24"/>
-          <w:szCs w:val="24"/>
-        </w:rPr>
-      </w:pPr>
-      <w:r>
-        <w:rPr>
-          <w:rFonts w:ascii="Times New Roman" w:cs="Times New Roman" w:eastAsia="Times New Roman" w:hAnsi="Times New Roman"/>
-          <w:sz w:val="24"/>
-          <w:szCs w:val="24"/>
-          <w:rtl w:val="0"/>
-        </w:rPr>
-        <w:t xml:space="preserve">Minimizar o risco de contaminação, aderindo às normas de higiene e segurança alimentar.</w:t>
-      </w:r>
-    </w:p>
-    <w:p>
-      <w:pPr>
-        <w:numPr>
-          <w:ilvl w:val="0"/>
-          <w:numId w:val="1"/>
-        </w:numPr>
-        <w:spacing w:after="200" w:before="0" w:line="360" w:lineRule="auto"/>
-        <w:ind w:left="720" w:hanging="360"/>
-        <w:jc w:val="both"/>
-        <w:rPr>
-          <w:rFonts w:ascii="Times New Roman" w:cs="Times New Roman" w:eastAsia="Times New Roman" w:hAnsi="Times New Roman"/>
-          <w:sz w:val="24"/>
-          <w:szCs w:val="24"/>
-        </w:rPr>
-      </w:pPr>
-      <w:r>
-        <w:rPr>
-          <w:rFonts w:ascii="Times New Roman" w:cs="Times New Roman" w:eastAsia="Times New Roman" w:hAnsi="Times New Roman"/>
-          <w:sz w:val="24"/>
-          <w:szCs w:val="24"/>
-          <w:rtl w:val="0"/>
-        </w:rPr>
-        <w:t xml:space="preserve">Permitir o envase de diferentes tipos e tamanhos de embalagens de forma automática, sem a necessidade de ajustes.</w:t>
+          <w:u w:val="none"/>
+        </w:rPr>
+      </w:pPr>
+      <w:r>
+        <w:rPr>
+          <w:rtl w:val="0"/>
+        </w:rPr>
+        <w:t xml:space="preserve">Integrar o hardware e o software de controle, realizando a montagem física do sistema e a programação da lógica de automação para a manipulação dos recipientes e o acionamento das válvulas de envase. </w:t>
       </w:r>
     </w:p>
     <w:p>
@@ -6296,12 +6409,14 @@
       </w:pPr>
       <w:r>
         <w:rPr>
-          <w:rFonts w:ascii="Times New Roman" w:cs="Times New Roman" w:eastAsia="Times New Roman" w:hAnsi="Times New Roman"/>
-          <w:sz w:val="24"/>
-          <w:szCs w:val="24"/>
-          <w:rtl w:val="0"/>
-        </w:rPr>
-        <w:t xml:space="preserve">Criar uma solução com alta relação custo-benefício e facilidade de operação e manutenção.</w:t>
+          <w:rtl w:val="0"/>
+        </w:rPr>
+        <w:t xml:space="preserve">Validar o funcionamento do dispositivo por meio de testes práticos, avaliando a precisão do volume envasado, a repetibilidade dos ciclos e a eficácia da redução de desperdícios no processo.</w:t>
+      </w:r>
+      <w:r>
+        <w:rPr>
+          <w:rtl w:val="0"/>
+        </w:rPr>
       </w:r>
     </w:p>
     <w:p>
@@ -6315,6 +6430,7 @@
         <w:rPr>
           <w:rtl w:val="0"/>
         </w:rPr>
+        <w:tab/>
       </w:r>
     </w:p>
     <w:p>
@@ -6375,8 +6491,6 @@
         <w:jc w:val="both"/>
         <w:rPr>
           <w:rFonts w:ascii="Times New Roman" w:cs="Times New Roman" w:eastAsia="Times New Roman" w:hAnsi="Times New Roman"/>
-          <w:sz w:val="24"/>
-          <w:szCs w:val="24"/>
         </w:rPr>
       </w:pPr>
       <w:r>
@@ -6388,16 +6502,6 @@
         </w:rPr>
         <w:t xml:space="preserve">Este projeto, ao desenvolver uma envasadora de baixo custo, insere-se no contexto de otimização de processos que buscam soluções eficientes e economicamente viáveis. Conforme LANG (2016), a busca por dimensionamento de bancadas e soluções para a produção de iogurte é um tema relevante na engenharia, e este trabalho contribui para essa área ao apresentar uma alternativa prática para uma Agroindústria real. Além disso, a aplicação de normas de segurança, como a NR-12 (BRASIL, 2016), que trata da segurança em máquinas e equipamentos, assegura que o projeto atenda aos requisitos legais e promova um ambiente de trabalho mais seguro. Assim, o projeto não apenas moderniza uma etapa crítica da produção, mas também contribui para a elevação da qualidade do produto final e para a redução de perdas, ao mesmo tempo em que serve como uma demonstração prática da aplicação de conceitos de robótica e automação.</w:t>
       </w:r>
-    </w:p>
-    <w:p>
-      <w:pPr>
-        <w:spacing w:after="0" w:before="0" w:line="360" w:lineRule="auto"/>
-        <w:ind w:left="0" w:firstLine="0"/>
-        <w:jc w:val="both"/>
-        <w:rPr>
-          <w:rFonts w:ascii="Times New Roman" w:cs="Times New Roman" w:eastAsia="Times New Roman" w:hAnsi="Times New Roman"/>
-        </w:rPr>
-      </w:pPr>
       <w:r>
         <w:br w:type="page"/>
       </w:r>
@@ -6795,12 +6899,12 @@
           <wp:inline distB="114300" distT="114300" distL="114300" distR="114300">
             <wp:extent cx="1260000" cy="2158800"/>
             <wp:effectExtent b="0" l="0" r="0" t="0"/>
-            <wp:docPr id="14" name="image7.png"/>
+            <wp:docPr id="14" name="image5.png"/>
             <a:graphic>
               <a:graphicData uri="http://schemas.openxmlformats.org/drawingml/2006/picture">
                 <pic:pic>
                   <pic:nvPicPr>
-                    <pic:cNvPr id="0" name="image7.png"/>
+                    <pic:cNvPr id="0" name="image5.png"/>
                     <pic:cNvPicPr preferRelativeResize="0"/>
                   </pic:nvPicPr>
                   <pic:blipFill>
@@ -7013,12 +7117,12 @@
           <wp:inline distB="114300" distT="114300" distL="114300" distR="114300">
             <wp:extent cx="1764525" cy="1838325"/>
             <wp:effectExtent b="0" l="0" r="0" t="0"/>
-            <wp:docPr id="13" name="image10.png"/>
+            <wp:docPr id="13" name="image2.png"/>
             <a:graphic>
               <a:graphicData uri="http://schemas.openxmlformats.org/drawingml/2006/picture">
                 <pic:pic>
                   <pic:nvPicPr>
-                    <pic:cNvPr id="0" name="image10.png"/>
+                    <pic:cNvPr id="0" name="image2.png"/>
                     <pic:cNvPicPr preferRelativeResize="0"/>
                   </pic:nvPicPr>
                   <pic:blipFill>
@@ -7186,12 +7290,12 @@
           <wp:inline distB="114300" distT="114300" distL="114300" distR="114300">
             <wp:extent cx="2160000" cy="1586057"/>
             <wp:effectExtent b="0" l="0" r="0" t="0"/>
-            <wp:docPr id="17" name="image3.png"/>
+            <wp:docPr id="16" name="image4.png"/>
             <a:graphic>
               <a:graphicData uri="http://schemas.openxmlformats.org/drawingml/2006/picture">
                 <pic:pic>
                   <pic:nvPicPr>
-                    <pic:cNvPr id="0" name="image3.png"/>
+                    <pic:cNvPr id="0" name="image4.png"/>
                     <pic:cNvPicPr preferRelativeResize="0"/>
                   </pic:nvPicPr>
                   <pic:blipFill>
@@ -7427,12 +7531,12 @@
           <wp:inline distB="114300" distT="114300" distL="114300" distR="114300">
             <wp:extent cx="2160000" cy="1533600"/>
             <wp:effectExtent b="0" l="0" r="0" t="0"/>
-            <wp:docPr id="15" name="image12.png"/>
+            <wp:docPr id="15" name="image10.png"/>
             <a:graphic>
               <a:graphicData uri="http://schemas.openxmlformats.org/drawingml/2006/picture">
                 <pic:pic>
                   <pic:nvPicPr>
-                    <pic:cNvPr id="0" name="image12.png"/>
+                    <pic:cNvPr id="0" name="image10.png"/>
                     <pic:cNvPicPr preferRelativeResize="0"/>
                   </pic:nvPicPr>
                   <pic:blipFill>
@@ -7605,12 +7709,12 @@
           <wp:inline distB="114300" distT="114300" distL="114300" distR="114300">
             <wp:extent cx="2520000" cy="2217600"/>
             <wp:effectExtent b="0" l="0" r="0" t="0"/>
-            <wp:docPr id="19" name="image5.png"/>
+            <wp:docPr id="18" name="image12.png"/>
             <a:graphic>
               <a:graphicData uri="http://schemas.openxmlformats.org/drawingml/2006/picture">
                 <pic:pic>
                   <pic:nvPicPr>
-                    <pic:cNvPr id="0" name="image5.png"/>
+                    <pic:cNvPr id="0" name="image12.png"/>
                     <pic:cNvPicPr preferRelativeResize="0"/>
                   </pic:nvPicPr>
                   <pic:blipFill>
@@ -7888,12 +7992,12 @@
           <wp:inline distB="114300" distT="114300" distL="114300" distR="114300">
             <wp:extent cx="2160000" cy="1632343"/>
             <wp:effectExtent b="0" l="0" r="0" t="0"/>
-            <wp:docPr id="18" name="image4.png"/>
+            <wp:docPr id="17" name="image8.png"/>
             <a:graphic>
               <a:graphicData uri="http://schemas.openxmlformats.org/drawingml/2006/picture">
                 <pic:pic>
                   <pic:nvPicPr>
-                    <pic:cNvPr id="0" name="image4.png"/>
+                    <pic:cNvPr id="0" name="image8.png"/>
                     <pic:cNvPicPr preferRelativeResize="0"/>
                   </pic:nvPicPr>
                   <pic:blipFill>
@@ -8077,12 +8181,12 @@
           <wp:inline distB="114300" distT="114300" distL="114300" distR="114300">
             <wp:extent cx="1800000" cy="1665818"/>
             <wp:effectExtent b="0" l="0" r="0" t="0"/>
-            <wp:docPr id="21" name="image9.png"/>
+            <wp:docPr id="20" name="image7.png"/>
             <a:graphic>
               <a:graphicData uri="http://schemas.openxmlformats.org/drawingml/2006/picture">
                 <pic:pic>
                   <pic:nvPicPr>
-                    <pic:cNvPr id="0" name="image9.png"/>
+                    <pic:cNvPr id="0" name="image7.png"/>
                     <pic:cNvPicPr preferRelativeResize="0"/>
                   </pic:nvPicPr>
                   <pic:blipFill>
@@ -8306,12 +8410,12 @@
           <wp:inline distB="114300" distT="114300" distL="114300" distR="114300">
             <wp:extent cx="1800000" cy="1800000"/>
             <wp:effectExtent b="0" l="0" r="0" t="0"/>
-            <wp:docPr id="20" name="image6.png"/>
+            <wp:docPr id="19" name="image3.png"/>
             <a:graphic>
               <a:graphicData uri="http://schemas.openxmlformats.org/drawingml/2006/picture">
                 <pic:pic>
                   <pic:nvPicPr>
-                    <pic:cNvPr id="0" name="image6.png"/>
+                    <pic:cNvPr id="0" name="image3.png"/>
                     <pic:cNvPicPr preferRelativeResize="0"/>
                   </pic:nvPicPr>
                   <pic:blipFill>
@@ -8575,12 +8679,12 @@
           <wp:inline distB="114300" distT="114300" distL="114300" distR="114300">
             <wp:extent cx="1440000" cy="1624320"/>
             <wp:effectExtent b="0" l="0" r="0" t="0"/>
-            <wp:docPr id="22" name="image2.png"/>
+            <wp:docPr id="21" name="image6.png"/>
             <a:graphic>
               <a:graphicData uri="http://schemas.openxmlformats.org/drawingml/2006/picture">
                 <pic:pic>
                   <pic:nvPicPr>
-                    <pic:cNvPr id="0" name="image2.png"/>
+                    <pic:cNvPr id="0" name="image6.png"/>
                     <pic:cNvPicPr preferRelativeResize="0"/>
                   </pic:nvPicPr>
                   <pic:blipFill>
@@ -9425,12 +9529,12 @@
           <wp:inline distB="114300" distT="114300" distL="114300" distR="114300">
             <wp:extent cx="5040000" cy="2872800"/>
             <wp:effectExtent b="0" l="0" r="0" t="0"/>
-            <wp:docPr id="11" name="image8.png"/>
+            <wp:docPr id="11" name="image9.png"/>
             <a:graphic>
               <a:graphicData uri="http://schemas.openxmlformats.org/drawingml/2006/picture">
                 <pic:pic>
                   <pic:nvPicPr>
-                    <pic:cNvPr id="0" name="image8.png"/>
+                    <pic:cNvPr id="0" name="image9.png"/>
                     <pic:cNvPicPr preferRelativeResize="0"/>
                   </pic:nvPicPr>
                   <pic:blipFill>
@@ -21085,9 +21189,9 @@
   <w:abstractNum w:abstractNumId="1">
     <w:lvl w:ilvl="0">
       <w:start w:val="1"/>
-      <w:numFmt w:val="bullet"/>
-      <w:lvlText w:val="●"/>
-      <w:lvlJc w:val="left"/>
+      <w:numFmt w:val="decimal"/>
+      <w:lvlText w:val="%1."/>
+      <w:lvlJc w:val="right"/>
       <w:pPr>
         <w:ind w:left="720" w:hanging="360"/>
       </w:pPr>
@@ -21097,9 +21201,9 @@
     </w:lvl>
     <w:lvl w:ilvl="1">
       <w:start w:val="1"/>
-      <w:numFmt w:val="bullet"/>
-      <w:lvlText w:val="○"/>
-      <w:lvlJc w:val="left"/>
+      <w:numFmt w:val="decimal"/>
+      <w:lvlText w:val="%1.%2."/>
+      <w:lvlJc w:val="right"/>
       <w:pPr>
         <w:ind w:left="1440" w:hanging="360"/>
       </w:pPr>
@@ -21109,9 +21213,9 @@
     </w:lvl>
     <w:lvl w:ilvl="2">
       <w:start w:val="1"/>
-      <w:numFmt w:val="bullet"/>
-      <w:lvlText w:val="■"/>
-      <w:lvlJc w:val="left"/>
+      <w:numFmt w:val="decimal"/>
+      <w:lvlText w:val="%1.%2.%3."/>
+      <w:lvlJc w:val="right"/>
       <w:pPr>
         <w:ind w:left="2160" w:hanging="360"/>
       </w:pPr>
@@ -21121,9 +21225,9 @@
     </w:lvl>
     <w:lvl w:ilvl="3">
       <w:start w:val="1"/>
-      <w:numFmt w:val="bullet"/>
-      <w:lvlText w:val="●"/>
-      <w:lvlJc w:val="left"/>
+      <w:numFmt w:val="decimal"/>
+      <w:lvlText w:val="%1.%2.%3.%4."/>
+      <w:lvlJc w:val="right"/>
       <w:pPr>
         <w:ind w:left="2880" w:hanging="360"/>
       </w:pPr>
@@ -21133,9 +21237,9 @@
     </w:lvl>
     <w:lvl w:ilvl="4">
       <w:start w:val="1"/>
-      <w:numFmt w:val="bullet"/>
-      <w:lvlText w:val="○"/>
-      <w:lvlJc w:val="left"/>
+      <w:numFmt w:val="decimal"/>
+      <w:lvlText w:val="%1.%2.%3.%4.%5."/>
+      <w:lvlJc w:val="right"/>
       <w:pPr>
         <w:ind w:left="3600" w:hanging="360"/>
       </w:pPr>
@@ -21145,9 +21249,9 @@
     </w:lvl>
     <w:lvl w:ilvl="5">
       <w:start w:val="1"/>
-      <w:numFmt w:val="bullet"/>
-      <w:lvlText w:val="■"/>
-      <w:lvlJc w:val="left"/>
+      <w:numFmt w:val="decimal"/>
+      <w:lvlText w:val="%1.%2.%3.%4.%5.%6."/>
+      <w:lvlJc w:val="right"/>
       <w:pPr>
         <w:ind w:left="4320" w:hanging="360"/>
       </w:pPr>
@@ -21157,9 +21261,9 @@
     </w:lvl>
     <w:lvl w:ilvl="6">
       <w:start w:val="1"/>
-      <w:numFmt w:val="bullet"/>
-      <w:lvlText w:val="●"/>
-      <w:lvlJc w:val="left"/>
+      <w:numFmt w:val="decimal"/>
+      <w:lvlText w:val="%1.%2.%3.%4.%5.%6.%7."/>
+      <w:lvlJc w:val="right"/>
       <w:pPr>
         <w:ind w:left="5040" w:hanging="360"/>
       </w:pPr>
@@ -21169,9 +21273,9 @@
     </w:lvl>
     <w:lvl w:ilvl="7">
       <w:start w:val="1"/>
-      <w:numFmt w:val="bullet"/>
-      <w:lvlText w:val="○"/>
-      <w:lvlJc w:val="left"/>
+      <w:numFmt w:val="decimal"/>
+      <w:lvlText w:val="%1.%2.%3.%4.%5.%6.%7.%8."/>
+      <w:lvlJc w:val="right"/>
       <w:pPr>
         <w:ind w:left="5760" w:hanging="360"/>
       </w:pPr>
@@ -21181,9 +21285,9 @@
     </w:lvl>
     <w:lvl w:ilvl="8">
       <w:start w:val="1"/>
-      <w:numFmt w:val="bullet"/>
-      <w:lvlText w:val="■"/>
-      <w:lvlJc w:val="left"/>
+      <w:numFmt w:val="decimal"/>
+      <w:lvlText w:val="%1.%2.%3.%4.%5.%6.%7.%8.%9."/>
+      <w:lvlJc w:val="right"/>
       <w:pPr>
         <w:ind w:left="6480" w:hanging="360"/>
       </w:pPr>

</xml_diff>